<commit_message>
style(lead-magnets): format all documents to 100% NASKAH.FK standard (Times New Roman, Open-Table, 4-4-3-3 margins)
</commit_message>
<xml_diff>
--- a/07_LEAD_MAGNETS/02_RESCUE_Checklist_Krisis_KEPK_dan_Sampel_FK.docx
+++ b/07_LEAD_MAGNETS/02_RESCUE_Checklist_Krisis_KEPK_dan_Sampel_FK.docx
@@ -3,137 +3,180 @@
 <w:document xmlns:wpc="http://schemas.microsoft.com/office/word/2010/wordprocessingCanvas" xmlns:mo="http://schemas.microsoft.com/office/mac/office/2008/main" xmlns:mc="http://schemas.openxmlformats.org/markup-compatibility/2006" xmlns:mv="urn:schemas-microsoft-com:mac:vml" xmlns:o="urn:schemas-microsoft-com:office:office" xmlns:r="http://schemas.openxmlformats.org/officeDocument/2006/relationships" xmlns:m="http://schemas.openxmlformats.org/officeDocument/2006/math" xmlns:v="urn:schemas-microsoft-com:vml" xmlns:wp14="http://schemas.microsoft.com/office/word/2010/wordprocessingDrawing" xmlns:wp="http://schemas.openxmlformats.org/drawingml/2006/wordprocessingDrawing" xmlns:w10="urn:schemas-microsoft-com:office:word" xmlns:w="http://schemas.openxmlformats.org/wordprocessingml/2006/main" xmlns:w14="http://schemas.microsoft.com/office/word/2010/wordml" xmlns:wpg="http://schemas.microsoft.com/office/word/2010/wordprocessingGroup" xmlns:wpi="http://schemas.microsoft.com/office/word/2010/wordprocessingInk" xmlns:wne="http://schemas.microsoft.com/office/word/2006/wordml" xmlns:wps="http://schemas.microsoft.com/office/word/2010/wordprocessingShape" mc:Ignorable="w14 wp14">
   <w:body>
     <w:p>
+      <w:pPr>
+        <w:jc w:val="center"/>
+      </w:pPr>
       <w:r>
         <w:rPr>
+          <w:rFonts w:ascii="Times New Roman" w:hAnsi="Times New Roman"/>
           <w:b/>
-          <w:color w:val="E85929"/>
-          <w:sz w:val="20"/>
+          <w:i w:val="0"/>
+          <w:color w:val="000000"/>
+          <w:sz w:val="28"/>
+          <w:rFonts w:ascii="Times New Roman" w:hAnsi="Times New Roman" w:cs="Times New Roman" w:eastAsia="Times New Roman"/>
         </w:rPr>
-        <w:t>NASKAH.FK — EMERGENCY RESCUE PROTOCOL</w:t>
+        <w:t>PANDUAN PENYELAMATAN KRISIS KEPK DAN SAMPEL PENELITIAN KEDOKTERAN</w:t>
         <w:br/>
       </w:r>
       <w:r>
         <w:rPr>
-          <w:b/>
-          <w:color w:val="071726"/>
-          <w:sz w:val="32"/>
+          <w:rFonts w:ascii="Times New Roman" w:hAnsi="Times New Roman"/>
+          <w:b w:val="0"/>
+          <w:i/>
+          <w:color w:val="000000"/>
+          <w:sz w:val="24"/>
+          <w:rFonts w:ascii="Times New Roman" w:hAnsi="Times New Roman" w:cs="Times New Roman" w:eastAsia="Times New Roman"/>
         </w:rPr>
-        <w:t>Checklist Penyelamatan Krisis KEPK &amp; Kriteria Sampel Skripsi FK</w:t>
-      </w:r>
-    </w:p>
-    <w:p>
-      <w:r>
-        <w:t>Panduan taktis mengatasi penolakan/revisi izin etik KEPK dan kegagalan matching kontrol.</w:t>
-      </w:r>
-    </w:p>
-    <w:p>
-      <w:r>
-        <w:t>―――――――――――――――――――――――――――――――――――――――――――――</w:t>
+        <w:t>Standard Operating Procedure Penanganan Hambatan Etik dan Matching Kontrol</w:t>
       </w:r>
     </w:p>
     <w:p>
       <w:pPr>
         <w:pStyle w:val="Heading1"/>
+        <w:spacing w:before="240" w:after="120"/>
       </w:pPr>
       <w:r>
-        <w:t>1. Protokol KEPK Tertahan / Ditolak</w:t>
+        <w:rPr>
+          <w:rFonts w:ascii="Times New Roman" w:hAnsi="Times New Roman"/>
+          <w:b/>
+          <w:i w:val="0"/>
+          <w:color w:val="000000"/>
+          <w:sz w:val="24"/>
+          <w:rFonts w:ascii="Times New Roman" w:hAnsi="Times New Roman" w:cs="Times New Roman" w:eastAsia="Times New Roman"/>
+        </w:rPr>
+        <w:t>1. Protokol Penanganan KEPK Tertahan atau Perbaikan Mayor</w:t>
       </w:r>
     </w:p>
     <w:p>
+      <w:pPr>
+        <w:jc w:val="both"/>
+      </w:pPr>
       <w:r>
         <w:rPr>
-          <w:b/>
+          <w:rFonts w:ascii="Times New Roman" w:hAnsi="Times New Roman"/>
+          <w:b w:val="0"/>
+          <w:i w:val="0"/>
+          <w:color w:val="000000"/>
+          <w:sz w:val="24"/>
+          <w:rFonts w:ascii="Times New Roman" w:hAnsi="Times New Roman" w:cs="Times New Roman" w:eastAsia="Times New Roman"/>
         </w:rPr>
-        <w:t>Jika protokol etik tertahan lebih dari 3 minggu atau menerima perbaikan mayor:</w:t>
+        <w:t>Apabila pengajuan persetujuan etik (Ethical Clearance) tertahan melebihi batas waktu normal atau menerima catatan perbaikan mayor, peneliti disarankan melakukan langkah mitigasi berikut:</w:t>
         <w:br/>
       </w:r>
       <w:r>
-        <w:t>• Audit Risiko Kerahasiaan Data: Pastikan seluruh lembar ekstraksi data rekam medis di-anonimkan (hapus Nama, NIK, No RM di draft mentah; gunakan Kode Sampel S-001 dst).</w:t>
+        <w:rPr>
+          <w:rFonts w:ascii="Times New Roman" w:hAnsi="Times New Roman"/>
+          <w:b w:val="0"/>
+          <w:i w:val="0"/>
+          <w:color w:val="000000"/>
+          <w:sz w:val="24"/>
+          <w:rFonts w:ascii="Times New Roman" w:hAnsi="Times New Roman" w:cs="Times New Roman" w:eastAsia="Times New Roman"/>
+        </w:rPr>
+        <w:t>a. Audit Kerahasiaan Data Rekam Medis: Seluruh instrumen ekstraksi data wajib di-anonimkan secara ketat tanpa mencantumkan identitas primer (Nama, NIK, No. RM) pada naskah kerja; gunakan pengkodean acak (contoh: S-001).</w:t>
         <w:br/>
-      </w:r>
-      <w:r>
-        <w:t>• Klausa Vulnerable Subjects: Jika melibatkan anak (&lt;18 th), wajib lampirkan Lembar Persetujuan Orang Tua (Informed Consent) DAN Lembar Persetujuan Anak (Assent Form).</w:t>
+        <w:t>b. Perlindungan Subjek Rentan (Vulnerable Subjects): Pada penelitian yang melibatkan subjek anak usia 7–17 tahun, wajib disertakan Formulir Persetujuan Orang Tua (Informed Consent) dan Formulir Persetujuan Anak (Assent Form).</w:t>
         <w:br/>
-      </w:r>
-      <w:r>
-        <w:t>• Form Justifikasi Tindakan Invasif: Cantumkan bahwa prosedur sampling (misal pengambilan darah) dilakukan oleh nakes berwenang dan sesuai SOP rumah sakit jejaring.</w:t>
+        <w:t>c. SOP Tindakan Klinis / Invasif: Pengambilan sampel biologis wajib menegaskan kompetensi tenaga pelaksana bersertifikasi dan SOP keselamatan rumah sakit rujukan.</w:t>
         <w:br/>
       </w:r>
     </w:p>
     <w:p>
       <w:pPr>
         <w:pStyle w:val="Heading1"/>
+        <w:spacing w:before="240" w:after="120"/>
       </w:pPr>
       <w:r>
-        <w:t>2. Penyelamatan Matching Kontrol Ambyar (Case-Control)</w:t>
+        <w:rPr>
+          <w:rFonts w:ascii="Times New Roman" w:hAnsi="Times New Roman"/>
+          <w:b/>
+          <w:i w:val="0"/>
+          <w:color w:val="000000"/>
+          <w:sz w:val="24"/>
+          <w:rFonts w:ascii="Times New Roman" w:hAnsi="Times New Roman" w:cs="Times New Roman" w:eastAsia="Times New Roman"/>
+        </w:rPr>
+        <w:t>2. Mitigasi Kegagalan Matching Kontrol pada Desain Kasus-Kontrol</w:t>
       </w:r>
     </w:p>
     <w:p>
+      <w:pPr>
+        <w:jc w:val="both"/>
+      </w:pPr>
       <w:r>
         <w:rPr>
-          <w:i/>
+          <w:rFonts w:ascii="Times New Roman" w:hAnsi="Times New Roman"/>
+          <w:b w:val="0"/>
+          <w:i w:val="0"/>
+          <w:color w:val="000000"/>
+          <w:sz w:val="24"/>
+          <w:rFonts w:ascii="Times New Roman" w:hAnsi="Times New Roman" w:cs="Times New Roman" w:eastAsia="Times New Roman"/>
         </w:rPr>
-        <w:t>Kendala: Kasus ada 40, tetapi kontrol yang match usia &amp; jenis kelamin hanya dapat 25.</w:t>
+        <w:t>Kendala umum penelitian kasus-kontrol di lingkungan rumah sakit adalah ketidakseimbangan jumlah kontrol yang memenuhi kriteria matching usia dan jenis kelamin. Solusi metodologis yang dapat dipertanggungjawabkan meliputi:</w:t>
         <w:br/>
-      </w:r>
-      <w:r>
-        <w:t>Solusi 1 — Relaksasi Kriteria Caliper: Perlebar rentang usia matching (misal: dari ±1 tahun menjadi ±3 tahun) dengan justifikasi biologis di Bab 3.</w:t>
+        <w:t>a. Relaksasi Kriteria Caliper: Memperlebar rentang usia matching (misal dari ±1 tahun menjadi ±3 tahun) dengan mencantumkan justifikasi biologis relevan pada Bab 3.</w:t>
         <w:br/>
-      </w:r>
-      <w:r>
-        <w:t>Solusi 2 — Unmatched Analysis + Multivariate Adjustment: Ubah protokol menjadi unmatched case-control, lalu masukkan variabel perancu (confounder) ke dalam model Regresi Logistik Ganda di Bab 4.</w:t>
+        <w:t>b. Analisis Unmatched dengan Penyesuaian Multivariat: Mengubah pendekatan menjadi unmatched case-control dan mengontrol variabel perancu (confounder) melalui uji Regresi Logistik Ganda pada Bab 4.</w:t>
         <w:br/>
-      </w:r>
-      <w:r>
-        <w:t>Solusi 3 — Rasio 1:N Alternatif: Jika sulit mencari kontrol 1:1, naikkan rasio kontrol menjadi 1:2 atau 1:3 pada kelompok yang tersedia untuk meningkatkan power uji statistik.</w:t>
+        <w:t>c. Penerapan Rasio 1:N: Menaikkan rasio kasus terhadap kontrol menjadi 1:2 atau 1:3 untuk mempertahankan power uji statistik apabila kelompok kontrol berlebih.</w:t>
         <w:br/>
       </w:r>
     </w:p>
     <w:p>
       <w:pPr>
         <w:pStyle w:val="Heading1"/>
+        <w:spacing w:before="240" w:after="120"/>
       </w:pPr>
       <w:r>
-        <w:t>3. Draft Surat Permohonan Percepatan Telaah Etik</w:t>
+        <w:rPr>
+          <w:rFonts w:ascii="Times New Roman" w:hAnsi="Times New Roman"/>
+          <w:b/>
+          <w:i w:val="0"/>
+          <w:color w:val="000000"/>
+          <w:sz w:val="24"/>
+          <w:rFonts w:ascii="Times New Roman" w:hAnsi="Times New Roman" w:cs="Times New Roman" w:eastAsia="Times New Roman"/>
+        </w:rPr>
+        <w:t>3. Format Surat Permohonan Percepatan Telaah Etik</w:t>
       </w:r>
     </w:p>
     <w:p>
+      <w:pPr>
+        <w:jc w:val="both"/>
+      </w:pPr>
       <w:r>
-        <w:t>Perihal: Permohonan Percepatan Telaah Lanjutan Protokol Etik No: [Nomor Registrasi]</w:t>
-        <w:br/>
+        <w:rPr>
+          <w:rFonts w:ascii="Times New Roman" w:hAnsi="Times New Roman"/>
+          <w:b w:val="0"/>
+          <w:i w:val="0"/>
+          <w:color w:val="000000"/>
+          <w:sz w:val="22"/>
+          <w:rFonts w:ascii="Times New Roman" w:hAnsi="Times New Roman" w:cs="Times New Roman" w:eastAsia="Times New Roman"/>
+        </w:rPr>
+        <w:t>Perihal : Permohonan Percepatan Telaah Lanjutan Protokol Etik No: [Nomor Registrasi]</w:t>
         <w:br/>
         <w:t>Kepada Yth. Ketua Komisi Etik Penelitian Kesehatan (KEPK)</w:t>
         <w:br/>
-        <w:t>[Nama Fakultas / Rumah Sakit]</w:t>
+        <w:t>[Nama Institusi / Rumah Sakit]</w:t>
         <w:br/>
         <w:br/>
         <w:t>Dengan hormat,</w:t>
         <w:br/>
-        <w:t>Saya yang bertanda tangan di bawah ini:</w:t>
-        <w:br/>
-        <w:t>Nama / NIM: [Nama Mahasiswa] / [NIM]</w:t>
-        <w:br/>
-        <w:t>Program Studi: Pendidikan Dokter / Profesi Dokter</w:t>
-        <w:br/>
-        <w:t>Judul Penelitian: [Judul Lengkap]</w:t>
+        <w:t>Sehubungan dengan proses perbaikan protokol penelitian atas nama [Nama Mahasiswa] / [NIM], Program Studi Kedokteran, dengan judul "[Judul Penelitian]", bersama ini disampaikan naskah perbaikan beserta Matriks Tanggapan Telaah Etik (Matrix of Revisions). Mengingat jadwal pengambilan data yang terikat batas waktu akademik, peneliti memohon kiranya naskah perbaikan dapat ditelaah pada kesempatan pertama.</w:t>
         <w:br/>
         <w:br/>
-        <w:t>Bersama surat ini mengajukan permohonan percepatan telaah revisi protokol etik. Seluruh catatan perbaikan telaah awal telah disesuaikan pada Dokumen Perbaikan Terlampir (Matrix of Revisions). Data penelitian sangat diperlukan untuk memenuhi jadwal sidang akhir semester berjalan.</w:t>
+        <w:t>Demikian permohonan ini disampaikan. Atas perhatian dan perkenan Bapak/Ibu, diucapkan terima kasih.</w:t>
         <w:br/>
         <w:br/>
-        <w:t>Demikian permohonan ini disampaikan. Atas perhatian dan bantuan Bapak/Ibu, saya ucapkan terima kasih.</w:t>
+        <w:t>Mengetahui,</w:t>
+        <w:br/>
+        <w:t>Dosen Pembimbing Utama                                   Peneliti Utama,</w:t>
         <w:br/>
         <w:br/>
-        <w:t>Hormat saya,</w:t>
         <w:br/>
-        <w:t>[Tanda Tangan &amp; Nama Mahasiswa]</w:t>
-        <w:br/>
-        <w:t>Mengetahui, Dosen Pembimbing Utama [Nama &amp; Gelar Dospem]</w:t>
+        <w:t>( [Nama &amp; Gelar Dospem] )                                  ( [Nama Mahasiswa] )</w:t>
       </w:r>
     </w:p>
     <w:sectPr>
-      <w:pgSz w:w="12240" w:h="15840"/>
-      <w:pgMar w:top="1440" w:right="1440" w:bottom="1440" w:left="1440" w:header="720" w:footer="720" w:gutter="0"/>
+      <w:pgSz w:w="11906" w:h="16838"/>
+      <w:pgMar w:top="2268" w:right="1701" w:bottom="1701" w:left="2268" w:header="720" w:footer="720" w:gutter="0"/>
       <w:cols w:space="720"/>
       <w:docGrid w:linePitch="360"/>
     </w:sectPr>
@@ -504,6 +547,14 @@
     <w:name w:val="Normal"/>
     <w:qFormat/>
     <w:rsid w:val="00FC693F"/>
+    <w:pPr>
+      <w:spacing w:line="276" w:lineRule="auto" w:after="80"/>
+    </w:pPr>
+    <w:rPr>
+      <w:rFonts w:ascii="Times New Roman" w:hAnsi="Times New Roman"/>
+      <w:color w:val="000000"/>
+      <w:sz w:val="24"/>
+    </w:rPr>
   </w:style>
   <w:style w:type="paragraph" w:styleId="Header">
     <w:name w:val="header"/>

</xml_diff>